<commit_message>
Keep lesson titles out of the right rail below 1440px
The one-line title rule (negative right margin into the column gap) now
applies only from 1440px, where the template has a 70px gap. Below that
the title wraps inside its column instead of running under the rail.
CSS additions document updated to match.
</commit_message>
<xml_diff>
--- a/maxlit-dual-language-spanish/MAX_Bilingue_Spanish_CSS_Additions.docx
+++ b/maxlit-dual-language-spanish/MAX_Bilingue_Spanish_CSS_Additions.docx
@@ -2899,7 +2899,7 @@
           <w:sz w:val="21"/>
           <w:szCs w:val="21"/>
         </w:rPr>
-        <w:t xml:space="preserve">Lesson title on one line, spacing between lesson parts, sub-step headings (h3) and filled dots for nested bullets.</w:t>
+        <w:t xml:space="preserve">Lesson title on one line on wide screens (1440px and up, where the 70px column gap exists), spacing between lesson parts, sub-step headings (h3) and filled dots for nested bullets.</w:t>
       </w:r>
     </w:p>
     <w:p>
@@ -3256,7 +3256,39 @@
           <w:sz w:val="16"/>
           <w:szCs w:val="16"/>
         </w:rPr>
-        <w:t xml:space="preserve">@media (min-width: 992px) {</w:t>
+        <w:t xml:space="preserve">/* Title may use the 70px column gap (one line, as in Figma); the template</w:t>
+      </w:r>
+    </w:p>
+    <w:p>
+      <w:pPr>
+        <w:shd w:fill="F3F4F6" w:color="auto" w:val="clear"/>
+        <w:spacing w:before="0" w:after="0" w:line="240"/>
+        <w:ind w:left="120" w:right="120"/>
+      </w:pPr>
+      <w:r>
+        <w:rPr>
+          <w:rFonts w:ascii="Consolas" w:cs="Consolas" w:eastAsia="Consolas" w:hAnsi="Consolas"/>
+          <w:color w:val="1F2937"/>
+          <w:sz w:val="16"/>
+          <w:szCs w:val="16"/>
+        </w:rPr>
+        <w:t xml:space="preserve">   only has a 70px gap from 1440px, below that it would run under the rail. */</w:t>
+      </w:r>
+    </w:p>
+    <w:p>
+      <w:pPr>
+        <w:shd w:fill="F3F4F6" w:color="auto" w:val="clear"/>
+        <w:spacing w:before="0" w:after="0" w:line="240"/>
+        <w:ind w:left="120" w:right="120"/>
+      </w:pPr>
+      <w:r>
+        <w:rPr>
+          <w:rFonts w:ascii="Consolas" w:cs="Consolas" w:eastAsia="Consolas" w:hAnsi="Consolas"/>
+          <w:color w:val="1F2937"/>
+          <w:sz w:val="16"/>
+          <w:szCs w:val="16"/>
+        </w:rPr>
+        <w:t xml:space="preserve">@media (min-width: 1440px) {</w:t>
       </w:r>
     </w:p>
     <w:p>

</xml_diff>